<commit_message>
DWÓJKA Bo7: nuklearne Calibri (szeryfy) + Wygr.sety sz=16 + Pkt SET rebuild + nowy szablon; DWÓJKA Bo3/Bo5: prawa krawędź SUMA gruba (12), narożniki cienkie
</commit_message>
<xml_diff>
--- a/DWÓJKA_Bo7.docx
+++ b/DWÓJKA_Bo7.docx
@@ -17,21 +17,21 @@
       </w:tblPr>
       <w:tblGrid>
         <w:gridCol w:w="531"/>
-        <w:gridCol w:w="694"/>
+        <w:gridCol w:w="687"/>
         <w:gridCol w:w="966"/>
-        <w:gridCol w:w="1069"/>
-        <w:gridCol w:w="881"/>
-        <w:gridCol w:w="1713"/>
-        <w:gridCol w:w="2406"/>
+        <w:gridCol w:w="1057"/>
+        <w:gridCol w:w="878"/>
+        <w:gridCol w:w="1692"/>
+        <w:gridCol w:w="3009"/>
+        <w:gridCol w:w="720"/>
+        <w:gridCol w:w="720"/>
+        <w:gridCol w:w="720"/>
+        <w:gridCol w:w="720"/>
+        <w:gridCol w:w="720"/>
+        <w:gridCol w:w="720"/>
+        <w:gridCol w:w="712"/>
         <w:gridCol w:w="733"/>
-        <w:gridCol w:w="707"/>
-        <w:gridCol w:w="707"/>
-        <w:gridCol w:w="707"/>
-        <w:gridCol w:w="707"/>
-        <w:gridCol w:w="704"/>
-        <w:gridCol w:w="721"/>
-        <w:gridCol w:w="733"/>
-        <w:gridCol w:w="1771"/>
+        <w:gridCol w:w="1165"/>
       </w:tblGrid>
       <w:tr>
         <w:trPr>
@@ -72,7 +72,7 @@
         </w:tc>
         <w:tc>
           <w:tcPr>
-            <w:tcW w:w="694" w:type="dxa"/>
+            <w:tcW w:w="687" w:type="dxa"/>
             <w:tcBorders>
               <w:top w:val="nil"/>
               <w:left w:val="nil"/>
@@ -126,7 +126,7 @@
         </w:tc>
         <w:tc>
           <w:tcPr>
-            <w:tcW w:w="1069" w:type="dxa"/>
+            <w:tcW w:w="1057" w:type="dxa"/>
             <w:tcBorders>
               <w:top w:val="nil"/>
               <w:left w:val="nil"/>
@@ -147,7 +147,7 @@
         </w:tc>
         <w:tc>
           <w:tcPr>
-            <w:tcW w:w="881" w:type="dxa"/>
+            <w:tcW w:w="878" w:type="dxa"/>
             <w:tcBorders>
               <w:top w:val="nil"/>
               <w:left w:val="nil"/>
@@ -180,7 +180,7 @@
         </w:tc>
         <w:tc>
           <w:tcPr>
-            <w:tcW w:w="1713" w:type="dxa"/>
+            <w:tcW w:w="1692" w:type="dxa"/>
             <w:tcBorders>
               <w:top w:val="nil"/>
               <w:left w:val="nil"/>
@@ -203,7 +203,7 @@
         </w:tc>
         <w:tc>
           <w:tcPr>
-            <w:tcW w:w="2406" w:type="dxa"/>
+            <w:tcW w:w="3009" w:type="dxa"/>
             <w:tcBorders>
               <w:top w:val="nil"/>
               <w:left w:val="nil"/>
@@ -228,7 +228,7 @@
         </w:tc>
         <w:tc>
           <w:tcPr>
-            <w:tcW w:w="733" w:type="dxa"/>
+            <w:tcW w:w="720" w:type="dxa"/>
             <w:tcBorders>
               <w:top w:val="single" w:sz="4" w:space="0" w:color="auto"/>
               <w:left w:val="single" w:sz="4" w:space="0" w:color="auto"/>
@@ -284,7 +284,7 @@
         </w:tc>
         <w:tc>
           <w:tcPr>
-            <w:tcW w:w="707" w:type="dxa"/>
+            <w:tcW w:w="720" w:type="dxa"/>
             <w:tcBorders>
               <w:top w:val="single" w:sz="4" w:space="0" w:color="auto"/>
               <w:left w:val="single" w:sz="4" w:space="0" w:color="auto"/>
@@ -348,7 +348,7 @@
         </w:tc>
         <w:tc>
           <w:tcPr>
-            <w:tcW w:w="707" w:type="dxa"/>
+            <w:tcW w:w="720" w:type="dxa"/>
             <w:tcBorders>
               <w:top w:val="single" w:sz="4" w:space="0" w:color="auto"/>
               <w:left w:val="single" w:sz="4" w:space="0" w:color="auto"/>
@@ -412,7 +412,7 @@
         </w:tc>
         <w:tc>
           <w:tcPr>
-            <w:tcW w:w="707" w:type="dxa"/>
+            <w:tcW w:w="720" w:type="dxa"/>
             <w:tcBorders>
               <w:top w:val="single" w:sz="4" w:space="0" w:color="auto"/>
               <w:left w:val="single" w:sz="4" w:space="0" w:color="auto"/>
@@ -478,7 +478,7 @@
         </w:tc>
         <w:tc>
           <w:tcPr>
-            <w:tcW w:w="707" w:type="dxa"/>
+            <w:tcW w:w="720" w:type="dxa"/>
             <w:tcBorders>
               <w:top w:val="single" w:sz="4" w:space="0" w:color="auto"/>
               <w:left w:val="single" w:sz="4" w:space="0" w:color="auto"/>
@@ -542,7 +542,7 @@
         </w:tc>
         <w:tc>
           <w:tcPr>
-            <w:tcW w:w="704" w:type="dxa"/>
+            <w:tcW w:w="720" w:type="dxa"/>
             <w:tcBorders>
               <w:top w:val="single" w:sz="4" w:space="0" w:color="auto"/>
               <w:left w:val="single" w:sz="4" w:space="0" w:color="auto"/>
@@ -606,7 +606,7 @@
         </w:tc>
         <w:tc>
           <w:tcPr>
-            <w:tcW w:w="721" w:type="dxa"/>
+            <w:tcW w:w="712" w:type="dxa"/>
             <w:tcBorders>
               <w:top w:val="single" w:sz="4" w:space="0" w:color="auto"/>
               <w:left w:val="single" w:sz="4" w:space="0" w:color="auto"/>
@@ -725,7 +725,7 @@
         </w:tc>
         <w:tc>
           <w:tcPr>
-            <w:tcW w:w="1771" w:type="dxa"/>
+            <w:tcW w:w="1165" w:type="dxa"/>
             <w:tcBorders>
               <w:top w:val="single" w:sz="4" w:space="0" w:color="auto"/>
               <w:left w:val="single" w:sz="4" w:space="0" w:color="auto"/>
@@ -766,7 +766,7 @@
         </w:trPr>
         <w:tc>
           <w:tcPr>
-            <w:tcW w:w="5854" w:type="dxa"/>
+            <w:tcW w:w="5811" w:type="dxa"/>
             <w:gridSpan w:val="6"/>
             <w:vMerge w:val="restart"/>
             <w:tcBorders>
@@ -906,7 +906,7 @@
         </w:tc>
         <w:tc>
           <w:tcPr>
-            <w:tcW w:w="2406" w:type="dxa"/>
+            <w:tcW w:w="3009" w:type="dxa"/>
             <w:tcBorders>
               <w:top w:val="single" w:sz="4" w:space="0" w:color="auto"/>
               <w:left w:val="single" w:sz="4" w:space="0" w:color="auto"/>
@@ -932,7 +932,7 @@
         </w:tc>
         <w:tc>
           <w:tcPr>
-            <w:tcW w:w="733" w:type="dxa"/>
+            <w:tcW w:w="720" w:type="dxa"/>
             <w:tcBorders>
               <w:top w:val="single" w:sz="4" w:space="0" w:color="auto"/>
               <w:left w:val="single" w:sz="4" w:space="0" w:color="auto"/>
@@ -954,7 +954,7 @@
         </w:tc>
         <w:tc>
           <w:tcPr>
-            <w:tcW w:w="707" w:type="dxa"/>
+            <w:tcW w:w="720" w:type="dxa"/>
             <w:tcBorders>
               <w:top w:val="single" w:sz="4" w:space="0" w:color="auto"/>
               <w:left w:val="single" w:sz="4" w:space="0" w:color="auto"/>
@@ -972,7 +972,7 @@
         </w:tc>
         <w:tc>
           <w:tcPr>
-            <w:tcW w:w="707" w:type="dxa"/>
+            <w:tcW w:w="720" w:type="dxa"/>
             <w:tcBorders>
               <w:top w:val="single" w:sz="4" w:space="0" w:color="auto"/>
               <w:left w:val="single" w:sz="4" w:space="0" w:color="auto"/>
@@ -990,7 +990,7 @@
         </w:tc>
         <w:tc>
           <w:tcPr>
-            <w:tcW w:w="707" w:type="dxa"/>
+            <w:tcW w:w="720" w:type="dxa"/>
             <w:tcBorders>
               <w:top w:val="single" w:sz="4" w:space="0" w:color="auto"/>
               <w:left w:val="single" w:sz="4" w:space="0" w:color="auto"/>
@@ -1012,7 +1012,7 @@
         </w:tc>
         <w:tc>
           <w:tcPr>
-            <w:tcW w:w="707" w:type="dxa"/>
+            <w:tcW w:w="720" w:type="dxa"/>
             <w:tcBorders>
               <w:top w:val="single" w:sz="4" w:space="0" w:color="auto"/>
               <w:left w:val="single" w:sz="4" w:space="0" w:color="auto"/>
@@ -1030,7 +1030,7 @@
         </w:tc>
         <w:tc>
           <w:tcPr>
-            <w:tcW w:w="704" w:type="dxa"/>
+            <w:tcW w:w="720" w:type="dxa"/>
             <w:tcBorders>
               <w:top w:val="single" w:sz="4" w:space="0" w:color="auto"/>
               <w:left w:val="single" w:sz="4" w:space="0" w:color="auto"/>
@@ -1048,7 +1048,7 @@
         </w:tc>
         <w:tc>
           <w:tcPr>
-            <w:tcW w:w="721" w:type="dxa"/>
+            <w:tcW w:w="712" w:type="dxa"/>
             <w:tcBorders>
               <w:top w:val="single" w:sz="4" w:space="0" w:color="auto"/>
               <w:left w:val="single" w:sz="4" w:space="0" w:color="auto"/>
@@ -1088,7 +1088,7 @@
         </w:tc>
         <w:tc>
           <w:tcPr>
-            <w:tcW w:w="1771" w:type="dxa"/>
+            <w:tcW w:w="1165" w:type="dxa"/>
             <w:tcBorders>
               <w:top w:val="single" w:sz="4" w:space="0" w:color="auto"/>
               <w:left w:val="single" w:sz="4" w:space="0" w:color="auto"/>
@@ -1115,7 +1115,7 @@
         </w:trPr>
         <w:tc>
           <w:tcPr>
-            <w:tcW w:w="5854" w:type="dxa"/>
+            <w:tcW w:w="5811" w:type="dxa"/>
             <w:gridSpan w:val="6"/>
             <w:vMerge/>
             <w:tcBorders>
@@ -1138,7 +1138,7 @@
         </w:tc>
         <w:tc>
           <w:tcPr>
-            <w:tcW w:w="2406" w:type="dxa"/>
+            <w:tcW w:w="3009" w:type="dxa"/>
             <w:tcBorders>
               <w:top w:val="single" w:sz="4" w:space="0" w:color="auto"/>
               <w:left w:val="single" w:sz="4" w:space="0" w:color="auto"/>
@@ -1164,7 +1164,7 @@
         </w:tc>
         <w:tc>
           <w:tcPr>
-            <w:tcW w:w="733" w:type="dxa"/>
+            <w:tcW w:w="720" w:type="dxa"/>
             <w:tcBorders>
               <w:top w:val="single" w:sz="4" w:space="0" w:color="auto"/>
               <w:left w:val="single" w:sz="4" w:space="0" w:color="auto"/>
@@ -1186,7 +1186,7 @@
         </w:tc>
         <w:tc>
           <w:tcPr>
-            <w:tcW w:w="707" w:type="dxa"/>
+            <w:tcW w:w="720" w:type="dxa"/>
             <w:tcBorders>
               <w:top w:val="single" w:sz="4" w:space="0" w:color="auto"/>
               <w:left w:val="single" w:sz="4" w:space="0" w:color="auto"/>
@@ -1204,7 +1204,7 @@
         </w:tc>
         <w:tc>
           <w:tcPr>
-            <w:tcW w:w="707" w:type="dxa"/>
+            <w:tcW w:w="720" w:type="dxa"/>
             <w:tcBorders>
               <w:top w:val="single" w:sz="4" w:space="0" w:color="auto"/>
               <w:left w:val="single" w:sz="4" w:space="0" w:color="auto"/>
@@ -1222,7 +1222,7 @@
         </w:tc>
         <w:tc>
           <w:tcPr>
-            <w:tcW w:w="707" w:type="dxa"/>
+            <w:tcW w:w="720" w:type="dxa"/>
             <w:tcBorders>
               <w:top w:val="single" w:sz="4" w:space="0" w:color="auto"/>
               <w:left w:val="single" w:sz="4" w:space="0" w:color="auto"/>
@@ -1244,7 +1244,7 @@
         </w:tc>
         <w:tc>
           <w:tcPr>
-            <w:tcW w:w="707" w:type="dxa"/>
+            <w:tcW w:w="720" w:type="dxa"/>
             <w:tcBorders>
               <w:top w:val="single" w:sz="4" w:space="0" w:color="auto"/>
               <w:left w:val="single" w:sz="4" w:space="0" w:color="auto"/>
@@ -1262,7 +1262,7 @@
         </w:tc>
         <w:tc>
           <w:tcPr>
-            <w:tcW w:w="704" w:type="dxa"/>
+            <w:tcW w:w="720" w:type="dxa"/>
             <w:tcBorders>
               <w:top w:val="single" w:sz="4" w:space="0" w:color="auto"/>
               <w:left w:val="single" w:sz="4" w:space="0" w:color="auto"/>
@@ -1280,7 +1280,7 @@
         </w:tc>
         <w:tc>
           <w:tcPr>
-            <w:tcW w:w="721" w:type="dxa"/>
+            <w:tcW w:w="712" w:type="dxa"/>
             <w:tcBorders>
               <w:top w:val="single" w:sz="4" w:space="0" w:color="auto"/>
               <w:left w:val="single" w:sz="4" w:space="0" w:color="auto"/>
@@ -1320,7 +1320,7 @@
         </w:tc>
         <w:tc>
           <w:tcPr>
-            <w:tcW w:w="1771" w:type="dxa"/>
+            <w:tcW w:w="1165" w:type="dxa"/>
             <w:tcBorders>
               <w:top w:val="single" w:sz="4" w:space="0" w:color="auto"/>
               <w:left w:val="single" w:sz="4" w:space="0" w:color="auto"/>
@@ -13457,22 +13457,22 @@
         <w:tblLook w:val="04A0" w:firstRow="1" w:lastRow="0" w:firstColumn="1" w:lastColumn="0" w:noHBand="0" w:noVBand="1"/>
       </w:tblPr>
       <w:tblGrid>
-        <w:gridCol w:w="531"/>
-        <w:gridCol w:w="694"/>
+        <w:gridCol w:w="530"/>
+        <w:gridCol w:w="693"/>
         <w:gridCol w:w="966"/>
-        <w:gridCol w:w="1069"/>
+        <w:gridCol w:w="1067"/>
         <w:gridCol w:w="881"/>
-        <w:gridCol w:w="1713"/>
-        <w:gridCol w:w="2406"/>
+        <w:gridCol w:w="1710"/>
+        <w:gridCol w:w="2973"/>
+        <w:gridCol w:w="720"/>
+        <w:gridCol w:w="720"/>
+        <w:gridCol w:w="720"/>
+        <w:gridCol w:w="720"/>
+        <w:gridCol w:w="720"/>
+        <w:gridCol w:w="720"/>
+        <w:gridCol w:w="708"/>
         <w:gridCol w:w="733"/>
-        <w:gridCol w:w="707"/>
-        <w:gridCol w:w="707"/>
-        <w:gridCol w:w="707"/>
-        <w:gridCol w:w="707"/>
-        <w:gridCol w:w="704"/>
-        <w:gridCol w:w="721"/>
-        <w:gridCol w:w="733"/>
-        <w:gridCol w:w="1771"/>
+        <w:gridCol w:w="1169"/>
       </w:tblGrid>
       <w:tr>
         <w:trPr>
@@ -13480,7 +13480,7 @@
         </w:trPr>
         <w:tc>
           <w:tcPr>
-            <w:tcW w:w="531" w:type="dxa"/>
+            <w:tcW w:w="530" w:type="dxa"/>
             <w:tcBorders>
               <w:top w:val="nil"/>
               <w:left w:val="nil"/>
@@ -13514,7 +13514,7 @@
         </w:tc>
         <w:tc>
           <w:tcPr>
-            <w:tcW w:w="694" w:type="dxa"/>
+            <w:tcW w:w="693" w:type="dxa"/>
             <w:tcBorders>
               <w:top w:val="nil"/>
               <w:left w:val="nil"/>
@@ -13568,7 +13568,7 @@
         </w:tc>
         <w:tc>
           <w:tcPr>
-            <w:tcW w:w="1069" w:type="dxa"/>
+            <w:tcW w:w="1067" w:type="dxa"/>
             <w:tcBorders>
               <w:top w:val="nil"/>
               <w:left w:val="nil"/>
@@ -13622,7 +13622,7 @@
         </w:tc>
         <w:tc>
           <w:tcPr>
-            <w:tcW w:w="1713" w:type="dxa"/>
+            <w:tcW w:w="1710" w:type="dxa"/>
             <w:tcBorders>
               <w:top w:val="nil"/>
               <w:left w:val="nil"/>
@@ -13645,7 +13645,7 @@
         </w:tc>
         <w:tc>
           <w:tcPr>
-            <w:tcW w:w="2406" w:type="dxa"/>
+            <w:tcW w:w="2973" w:type="dxa"/>
             <w:tcBorders>
               <w:top w:val="nil"/>
               <w:left w:val="nil"/>
@@ -13670,7 +13670,7 @@
         </w:tc>
         <w:tc>
           <w:tcPr>
-            <w:tcW w:w="733" w:type="dxa"/>
+            <w:tcW w:w="720" w:type="dxa"/>
             <w:tcBorders>
               <w:top w:val="single" w:sz="4" w:space="0" w:color="auto"/>
               <w:left w:val="single" w:sz="4" w:space="0" w:color="auto"/>
@@ -13726,7 +13726,7 @@
         </w:tc>
         <w:tc>
           <w:tcPr>
-            <w:tcW w:w="707" w:type="dxa"/>
+            <w:tcW w:w="720" w:type="dxa"/>
             <w:tcBorders>
               <w:top w:val="single" w:sz="4" w:space="0" w:color="auto"/>
               <w:left w:val="single" w:sz="4" w:space="0" w:color="auto"/>
@@ -13790,7 +13790,7 @@
         </w:tc>
         <w:tc>
           <w:tcPr>
-            <w:tcW w:w="707" w:type="dxa"/>
+            <w:tcW w:w="720" w:type="dxa"/>
             <w:tcBorders>
               <w:top w:val="single" w:sz="4" w:space="0" w:color="auto"/>
               <w:left w:val="single" w:sz="4" w:space="0" w:color="auto"/>
@@ -13854,7 +13854,7 @@
         </w:tc>
         <w:tc>
           <w:tcPr>
-            <w:tcW w:w="707" w:type="dxa"/>
+            <w:tcW w:w="720" w:type="dxa"/>
             <w:tcBorders>
               <w:top w:val="single" w:sz="4" w:space="0" w:color="auto"/>
               <w:left w:val="single" w:sz="4" w:space="0" w:color="auto"/>
@@ -13920,7 +13920,7 @@
         </w:tc>
         <w:tc>
           <w:tcPr>
-            <w:tcW w:w="707" w:type="dxa"/>
+            <w:tcW w:w="720" w:type="dxa"/>
             <w:tcBorders>
               <w:top w:val="single" w:sz="4" w:space="0" w:color="auto"/>
               <w:left w:val="single" w:sz="4" w:space="0" w:color="auto"/>
@@ -13984,7 +13984,7 @@
         </w:tc>
         <w:tc>
           <w:tcPr>
-            <w:tcW w:w="704" w:type="dxa"/>
+            <w:tcW w:w="720" w:type="dxa"/>
             <w:tcBorders>
               <w:top w:val="single" w:sz="4" w:space="0" w:color="auto"/>
               <w:left w:val="single" w:sz="4" w:space="0" w:color="auto"/>
@@ -14048,7 +14048,7 @@
         </w:tc>
         <w:tc>
           <w:tcPr>
-            <w:tcW w:w="721" w:type="dxa"/>
+            <w:tcW w:w="708" w:type="dxa"/>
             <w:tcBorders>
               <w:top w:val="single" w:sz="4" w:space="0" w:color="auto"/>
               <w:left w:val="single" w:sz="4" w:space="0" w:color="auto"/>
@@ -14167,7 +14167,7 @@
         </w:tc>
         <w:tc>
           <w:tcPr>
-            <w:tcW w:w="1771" w:type="dxa"/>
+            <w:tcW w:w="1169" w:type="dxa"/>
             <w:tcBorders>
               <w:top w:val="single" w:sz="4" w:space="0" w:color="auto"/>
               <w:left w:val="single" w:sz="4" w:space="0" w:color="auto"/>
@@ -14208,7 +14208,7 @@
         </w:trPr>
         <w:tc>
           <w:tcPr>
-            <w:tcW w:w="5854" w:type="dxa"/>
+            <w:tcW w:w="5847" w:type="dxa"/>
             <w:gridSpan w:val="6"/>
             <w:vMerge w:val="restart"/>
             <w:tcBorders>
@@ -14348,7 +14348,7 @@
         </w:tc>
         <w:tc>
           <w:tcPr>
-            <w:tcW w:w="2406" w:type="dxa"/>
+            <w:tcW w:w="2973" w:type="dxa"/>
             <w:tcBorders>
               <w:top w:val="single" w:sz="4" w:space="0" w:color="auto"/>
               <w:left w:val="single" w:sz="4" w:space="0" w:color="auto"/>
@@ -14374,7 +14374,7 @@
         </w:tc>
         <w:tc>
           <w:tcPr>
-            <w:tcW w:w="733" w:type="dxa"/>
+            <w:tcW w:w="720" w:type="dxa"/>
             <w:tcBorders>
               <w:top w:val="single" w:sz="4" w:space="0" w:color="auto"/>
               <w:left w:val="single" w:sz="4" w:space="0" w:color="auto"/>
@@ -14396,7 +14396,7 @@
         </w:tc>
         <w:tc>
           <w:tcPr>
-            <w:tcW w:w="707" w:type="dxa"/>
+            <w:tcW w:w="720" w:type="dxa"/>
             <w:tcBorders>
               <w:top w:val="single" w:sz="4" w:space="0" w:color="auto"/>
               <w:left w:val="single" w:sz="4" w:space="0" w:color="auto"/>
@@ -14414,7 +14414,7 @@
         </w:tc>
         <w:tc>
           <w:tcPr>
-            <w:tcW w:w="707" w:type="dxa"/>
+            <w:tcW w:w="720" w:type="dxa"/>
             <w:tcBorders>
               <w:top w:val="single" w:sz="4" w:space="0" w:color="auto"/>
               <w:left w:val="single" w:sz="4" w:space="0" w:color="auto"/>
@@ -14432,7 +14432,7 @@
         </w:tc>
         <w:tc>
           <w:tcPr>
-            <w:tcW w:w="707" w:type="dxa"/>
+            <w:tcW w:w="720" w:type="dxa"/>
             <w:tcBorders>
               <w:top w:val="single" w:sz="4" w:space="0" w:color="auto"/>
               <w:left w:val="single" w:sz="4" w:space="0" w:color="auto"/>
@@ -14454,7 +14454,7 @@
         </w:tc>
         <w:tc>
           <w:tcPr>
-            <w:tcW w:w="707" w:type="dxa"/>
+            <w:tcW w:w="720" w:type="dxa"/>
             <w:tcBorders>
               <w:top w:val="single" w:sz="4" w:space="0" w:color="auto"/>
               <w:left w:val="single" w:sz="4" w:space="0" w:color="auto"/>
@@ -14472,7 +14472,7 @@
         </w:tc>
         <w:tc>
           <w:tcPr>
-            <w:tcW w:w="704" w:type="dxa"/>
+            <w:tcW w:w="720" w:type="dxa"/>
             <w:tcBorders>
               <w:top w:val="single" w:sz="4" w:space="0" w:color="auto"/>
               <w:left w:val="single" w:sz="4" w:space="0" w:color="auto"/>
@@ -14490,7 +14490,7 @@
         </w:tc>
         <w:tc>
           <w:tcPr>
-            <w:tcW w:w="721" w:type="dxa"/>
+            <w:tcW w:w="708" w:type="dxa"/>
             <w:tcBorders>
               <w:top w:val="single" w:sz="4" w:space="0" w:color="auto"/>
               <w:left w:val="single" w:sz="4" w:space="0" w:color="auto"/>
@@ -14530,7 +14530,7 @@
         </w:tc>
         <w:tc>
           <w:tcPr>
-            <w:tcW w:w="1771" w:type="dxa"/>
+            <w:tcW w:w="1169" w:type="dxa"/>
             <w:tcBorders>
               <w:top w:val="single" w:sz="4" w:space="0" w:color="auto"/>
               <w:left w:val="single" w:sz="4" w:space="0" w:color="auto"/>
@@ -14557,7 +14557,7 @@
         </w:trPr>
         <w:tc>
           <w:tcPr>
-            <w:tcW w:w="5854" w:type="dxa"/>
+            <w:tcW w:w="5847" w:type="dxa"/>
             <w:gridSpan w:val="6"/>
             <w:vMerge/>
             <w:tcBorders>
@@ -14580,7 +14580,7 @@
         </w:tc>
         <w:tc>
           <w:tcPr>
-            <w:tcW w:w="2406" w:type="dxa"/>
+            <w:tcW w:w="2973" w:type="dxa"/>
             <w:tcBorders>
               <w:top w:val="single" w:sz="4" w:space="0" w:color="auto"/>
               <w:left w:val="single" w:sz="4" w:space="0" w:color="auto"/>
@@ -14606,7 +14606,7 @@
         </w:tc>
         <w:tc>
           <w:tcPr>
-            <w:tcW w:w="733" w:type="dxa"/>
+            <w:tcW w:w="720" w:type="dxa"/>
             <w:tcBorders>
               <w:top w:val="single" w:sz="4" w:space="0" w:color="auto"/>
               <w:left w:val="single" w:sz="4" w:space="0" w:color="auto"/>
@@ -14628,7 +14628,7 @@
         </w:tc>
         <w:tc>
           <w:tcPr>
-            <w:tcW w:w="707" w:type="dxa"/>
+            <w:tcW w:w="720" w:type="dxa"/>
             <w:tcBorders>
               <w:top w:val="single" w:sz="4" w:space="0" w:color="auto"/>
               <w:left w:val="single" w:sz="4" w:space="0" w:color="auto"/>
@@ -14646,7 +14646,7 @@
         </w:tc>
         <w:tc>
           <w:tcPr>
-            <w:tcW w:w="707" w:type="dxa"/>
+            <w:tcW w:w="720" w:type="dxa"/>
             <w:tcBorders>
               <w:top w:val="single" w:sz="4" w:space="0" w:color="auto"/>
               <w:left w:val="single" w:sz="4" w:space="0" w:color="auto"/>
@@ -14664,7 +14664,7 @@
         </w:tc>
         <w:tc>
           <w:tcPr>
-            <w:tcW w:w="707" w:type="dxa"/>
+            <w:tcW w:w="720" w:type="dxa"/>
             <w:tcBorders>
               <w:top w:val="single" w:sz="4" w:space="0" w:color="auto"/>
               <w:left w:val="single" w:sz="4" w:space="0" w:color="auto"/>
@@ -14686,7 +14686,7 @@
         </w:tc>
         <w:tc>
           <w:tcPr>
-            <w:tcW w:w="707" w:type="dxa"/>
+            <w:tcW w:w="720" w:type="dxa"/>
             <w:tcBorders>
               <w:top w:val="single" w:sz="4" w:space="0" w:color="auto"/>
               <w:left w:val="single" w:sz="4" w:space="0" w:color="auto"/>
@@ -14704,7 +14704,7 @@
         </w:tc>
         <w:tc>
           <w:tcPr>
-            <w:tcW w:w="704" w:type="dxa"/>
+            <w:tcW w:w="720" w:type="dxa"/>
             <w:tcBorders>
               <w:top w:val="single" w:sz="4" w:space="0" w:color="auto"/>
               <w:left w:val="single" w:sz="4" w:space="0" w:color="auto"/>
@@ -14722,7 +14722,7 @@
         </w:tc>
         <w:tc>
           <w:tcPr>
-            <w:tcW w:w="721" w:type="dxa"/>
+            <w:tcW w:w="708" w:type="dxa"/>
             <w:tcBorders>
               <w:top w:val="single" w:sz="4" w:space="0" w:color="auto"/>
               <w:left w:val="single" w:sz="4" w:space="0" w:color="auto"/>
@@ -14762,7 +14762,7 @@
         </w:tc>
         <w:tc>
           <w:tcPr>
-            <w:tcW w:w="1771" w:type="dxa"/>
+            <w:tcW w:w="1169" w:type="dxa"/>
             <w:tcBorders>
               <w:top w:val="single" w:sz="4" w:space="0" w:color="auto"/>
               <w:left w:val="single" w:sz="4" w:space="0" w:color="auto"/>
@@ -24873,6 +24873,17 @@
 </file>
 
 <file path=customXml/item2.xml><?xml version="1.0" encoding="utf-8"?>
+<p:properties xmlns:p="http://schemas.microsoft.com/office/2006/metadata/properties" xmlns:xsi="http://www.w3.org/2001/XMLSchema-instance" xmlns:pc="http://schemas.microsoft.com/office/infopath/2007/PartnerControls">
+  <documentManagement>
+    <TaxCatchAll xmlns="6e3c809f-d77f-4965-8c59-52bc5988e08d" xsi:nil="true"/>
+    <lcf76f155ced4ddcb4097134ff3c332f xmlns="6011e175-94d7-470b-a25b-96e606435ba7">
+      <Terms xmlns="http://schemas.microsoft.com/office/infopath/2007/PartnerControls"/>
+    </lcf76f155ced4ddcb4097134ff3c332f>
+  </documentManagement>
+</p:properties>
+</file>
+
+<file path=customXml/item3.xml><?xml version="1.0" encoding="utf-8"?>
 <ct:contentTypeSchema xmlns:ct="http://schemas.microsoft.com/office/2006/metadata/contentType" xmlns:ma="http://schemas.microsoft.com/office/2006/metadata/properties/metaAttributes" ct:_="" ma:_="" ma:contentTypeName="Dokument" ma:contentTypeID="0x010100E02B0782D6F96B44A7C1A6483B3F88A5" ma:contentTypeVersion="10" ma:contentTypeDescription="Utwórz nowy dokument." ma:contentTypeScope="" ma:versionID="dafbd3aba1efe586ac978fd8b8b0afe5">
   <xsd:schema xmlns:xsd="http://www.w3.org/2001/XMLSchema" xmlns:xs="http://www.w3.org/2001/XMLSchema" xmlns:p="http://schemas.microsoft.com/office/2006/metadata/properties" xmlns:ns2="6011e175-94d7-470b-a25b-96e606435ba7" xmlns:ns3="6e3c809f-d77f-4965-8c59-52bc5988e08d" targetNamespace="http://schemas.microsoft.com/office/2006/metadata/properties" ma:root="true" ma:fieldsID="632b28c003267633fc74dc71523c1969" ns2:_="" ns3:_="">
     <xsd:import namespace="6011e175-94d7-470b-a25b-96e606435ba7"/>
@@ -25061,17 +25072,6 @@
 </ct:contentTypeSchema>
 </file>
 
-<file path=customXml/item3.xml><?xml version="1.0" encoding="utf-8"?>
-<p:properties xmlns:p="http://schemas.microsoft.com/office/2006/metadata/properties" xmlns:xsi="http://www.w3.org/2001/XMLSchema-instance" xmlns:pc="http://schemas.microsoft.com/office/infopath/2007/PartnerControls">
-  <documentManagement>
-    <TaxCatchAll xmlns="6e3c809f-d77f-4965-8c59-52bc5988e08d" xsi:nil="true"/>
-    <lcf76f155ced4ddcb4097134ff3c332f xmlns="6011e175-94d7-470b-a25b-96e606435ba7">
-      <Terms xmlns="http://schemas.microsoft.com/office/infopath/2007/PartnerControls"/>
-    </lcf76f155ced4ddcb4097134ff3c332f>
-  </documentManagement>
-</p:properties>
-</file>
-
 <file path=customXml/itemProps1.xml><?xml version="1.0" encoding="utf-8"?>
 <ds:datastoreItem xmlns:ds="http://schemas.openxmlformats.org/officeDocument/2006/customXml" ds:itemID="{7CBD2BD3-90DE-4AB6-91CE-6B3CC7002439}">
   <ds:schemaRefs>
@@ -25081,6 +25081,17 @@
 </file>
 
 <file path=customXml/itemProps2.xml><?xml version="1.0" encoding="utf-8"?>
+<ds:datastoreItem xmlns:ds="http://schemas.openxmlformats.org/officeDocument/2006/customXml" ds:itemID="{D1250B38-05D2-4495-BD86-DF85DBE4CE3A}">
+  <ds:schemaRefs>
+    <ds:schemaRef ds:uri="http://schemas.microsoft.com/office/2006/metadata/properties"/>
+    <ds:schemaRef ds:uri="http://schemas.microsoft.com/office/infopath/2007/PartnerControls"/>
+    <ds:schemaRef ds:uri="6e3c809f-d77f-4965-8c59-52bc5988e08d"/>
+    <ds:schemaRef ds:uri="6011e175-94d7-470b-a25b-96e606435ba7"/>
+  </ds:schemaRefs>
+</ds:datastoreItem>
+</file>
+
+<file path=customXml/itemProps3.xml><?xml version="1.0" encoding="utf-8"?>
 <ds:datastoreItem xmlns:ds="http://schemas.openxmlformats.org/officeDocument/2006/customXml" ds:itemID="{8D075643-BC04-4701-AE66-86D30D057DE1}">
   <ds:schemaRefs>
     <ds:schemaRef ds:uri="http://schemas.microsoft.com/office/2006/metadata/contentType"/>
@@ -25099,17 +25110,6 @@
 </ds:datastoreItem>
 </file>
 
-<file path=customXml/itemProps3.xml><?xml version="1.0" encoding="utf-8"?>
-<ds:datastoreItem xmlns:ds="http://schemas.openxmlformats.org/officeDocument/2006/customXml" ds:itemID="{D1250B38-05D2-4495-BD86-DF85DBE4CE3A}">
-  <ds:schemaRefs>
-    <ds:schemaRef ds:uri="http://schemas.microsoft.com/office/2006/metadata/properties"/>
-    <ds:schemaRef ds:uri="http://schemas.microsoft.com/office/infopath/2007/PartnerControls"/>
-    <ds:schemaRef ds:uri="6e3c809f-d77f-4965-8c59-52bc5988e08d"/>
-    <ds:schemaRef ds:uri="6011e175-94d7-470b-a25b-96e606435ba7"/>
-  </ds:schemaRefs>
-</ds:datastoreItem>
-</file>
-
 <file path=docMetadata/LabelInfo.xml><?xml version="1.0" encoding="utf-8"?>
 <clbl:labelList xmlns:clbl="http://schemas.microsoft.com/office/2020/mipLabelMetadata">
   <clbl:label id="{b9766e0e-0d79-4442-b71d-65cafbb5c995}" enabled="1" method="Standard" siteId="{62115917-00ce-4682-9e15-bc8d4e1c73e8}" contentBits="0" removed="0"/>

</xml_diff>